<commit_message>
React JS series is over almost, last fresh push
</commit_message>
<xml_diff>
--- a/ReactJS-Part4.docx
+++ b/ReactJS-Part4.docx
@@ -791,16 +791,16 @@
         <mc:AlternateContent>
           <mc:Choice Requires="wps">
             <w:drawing>
-              <wp:anchor distT="0" distB="0" distL="114300" distR="114300" simplePos="0" relativeHeight="251659264" behindDoc="0" locked="0" layoutInCell="1" allowOverlap="1" wp14:anchorId="5102AFF5" wp14:editId="109B6A9E">
+              <wp:anchor distT="0" distB="0" distL="114300" distR="114300" simplePos="0" relativeHeight="251659264" behindDoc="0" locked="0" layoutInCell="1" allowOverlap="1" wp14:anchorId="5102AFF5" wp14:editId="6F33DED4">
                 <wp:simplePos x="0" y="0"/>
                 <wp:positionH relativeFrom="column">
-                  <wp:posOffset>5035550</wp:posOffset>
+                  <wp:posOffset>5036127</wp:posOffset>
                 </wp:positionH>
                 <wp:positionV relativeFrom="paragraph">
-                  <wp:posOffset>901700</wp:posOffset>
+                  <wp:posOffset>898814</wp:posOffset>
                 </wp:positionV>
-                <wp:extent cx="1524000" cy="1187450"/>
-                <wp:effectExtent l="0" t="0" r="19050" b="12700"/>
+                <wp:extent cx="1524000" cy="741218"/>
+                <wp:effectExtent l="0" t="0" r="19050" b="20955"/>
                 <wp:wrapNone/>
                 <wp:docPr id="1994528717" name="Text Box 1"/>
                 <wp:cNvGraphicFramePr/>
@@ -811,7 +811,7 @@
                       <wps:spPr>
                         <a:xfrm>
                           <a:off x="0" y="0"/>
-                          <a:ext cx="1524000" cy="1187450"/>
+                          <a:ext cx="1524000" cy="741218"/>
                         </a:xfrm>
                         <a:prstGeom prst="rect">
                           <a:avLst/>
@@ -828,7 +828,18 @@
                       <wps:txbx>
                         <w:txbxContent>
                           <w:p>
+                            <w:pPr>
+                              <w:jc w:val="both"/>
+                              <w:rPr>
+                                <w:sz w:val="16"/>
+                                <w:szCs w:val="16"/>
+                              </w:rPr>
+                            </w:pPr>
                             <w:r>
+                              <w:rPr>
+                                <w:sz w:val="16"/>
+                                <w:szCs w:val="16"/>
+                              </w:rPr>
                               <w:t>This function is used to declare all your application paths and their corresponding components in a clean, nested structure.</w:t>
                             </w:r>
                           </w:p>
@@ -858,11 +869,22 @@
                 <v:stroke joinstyle="miter"/>
                 <v:path gradientshapeok="t" o:connecttype="rect"/>
               </v:shapetype>
-              <v:shape id="Text Box 1" o:spid="_x0000_s1026" type="#_x0000_t202" style="position:absolute;left:0;text-align:left;margin-left:396.5pt;margin-top:71pt;width:120pt;height:93.5pt;z-index:251659264;visibility:visible;mso-wrap-style:square;mso-width-percent:0;mso-height-percent:0;mso-wrap-distance-left:9pt;mso-wrap-distance-top:0;mso-wrap-distance-right:9pt;mso-wrap-distance-bottom:0;mso-position-horizontal:absolute;mso-position-horizontal-relative:text;mso-position-vertical:absolute;mso-position-vertical-relative:text;mso-width-percent:0;mso-height-percent:0;mso-width-relative:margin;mso-height-relative:margin;v-text-anchor:top" o:gfxdata="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" fillcolor="white [3201]" strokeweight=".5pt">
+              <v:shape id="Text Box 1" o:spid="_x0000_s1026" type="#_x0000_t202" style="position:absolute;left:0;text-align:left;margin-left:396.55pt;margin-top:70.75pt;width:120pt;height:58.35pt;z-index:251659264;visibility:visible;mso-wrap-style:square;mso-width-percent:0;mso-height-percent:0;mso-wrap-distance-left:9pt;mso-wrap-distance-top:0;mso-wrap-distance-right:9pt;mso-wrap-distance-bottom:0;mso-position-horizontal:absolute;mso-position-horizontal-relative:text;mso-position-vertical:absolute;mso-position-vertical-relative:text;mso-width-percent:0;mso-height-percent:0;mso-width-relative:margin;mso-height-relative:margin;v-text-anchor:top" o:gfxdata="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" fillcolor="white [3201]" strokeweight=".5pt">
                 <v:textbox>
                   <w:txbxContent>
                     <w:p>
+                      <w:pPr>
+                        <w:jc w:val="both"/>
+                        <w:rPr>
+                          <w:sz w:val="16"/>
+                          <w:szCs w:val="16"/>
+                        </w:rPr>
+                      </w:pPr>
                       <w:r>
+                        <w:rPr>
+                          <w:sz w:val="16"/>
+                          <w:szCs w:val="16"/>
+                        </w:rPr>
                         <w:t>This function is used to declare all your application paths and their corresponding components in a clean, nested structure.</w:t>
                       </w:r>
                     </w:p>
@@ -3736,6 +3758,441 @@
         <w:jc w:val="both"/>
       </w:pPr>
     </w:p>
+    <w:p>
+      <w:pPr>
+        <w:jc w:val="both"/>
+      </w:pPr>
+      <w:r>
+        <w:t xml:space="preserve">Also, </w:t>
+      </w:r>
+    </w:p>
+    <w:tbl>
+      <w:tblPr>
+        <w:tblW w:w="0" w:type="auto"/>
+        <w:jc w:val="center"/>
+        <w:tblCellSpacing w:w="15" w:type="dxa"/>
+        <w:tblBorders>
+          <w:top w:val="single" w:sz="4" w:space="0" w:color="auto"/>
+          <w:left w:val="single" w:sz="4" w:space="0" w:color="auto"/>
+          <w:bottom w:val="single" w:sz="4" w:space="0" w:color="auto"/>
+          <w:right w:val="single" w:sz="4" w:space="0" w:color="auto"/>
+          <w:insideH w:val="single" w:sz="4" w:space="0" w:color="auto"/>
+          <w:insideV w:val="single" w:sz="4" w:space="0" w:color="auto"/>
+        </w:tblBorders>
+        <w:tblCellMar>
+          <w:top w:w="15" w:type="dxa"/>
+          <w:left w:w="15" w:type="dxa"/>
+          <w:bottom w:w="15" w:type="dxa"/>
+          <w:right w:w="15" w:type="dxa"/>
+        </w:tblCellMar>
+        <w:tblLook w:val="04A0" w:firstRow="1" w:lastRow="0" w:firstColumn="1" w:lastColumn="0" w:noHBand="0" w:noVBand="1"/>
+      </w:tblPr>
+      <w:tblGrid>
+        <w:gridCol w:w="1863"/>
+        <w:gridCol w:w="4178"/>
+      </w:tblGrid>
+      <w:tr>
+        <w:trPr>
+          <w:tblHeader/>
+          <w:tblCellSpacing w:w="15" w:type="dxa"/>
+          <w:jc w:val="center"/>
+        </w:trPr>
+        <w:tc>
+          <w:tcPr>
+            <w:tcW w:w="0" w:type="auto"/>
+            <w:vAlign w:val="center"/>
+            <w:hideMark/>
+          </w:tcPr>
+          <w:p>
+            <w:pPr>
+              <w:jc w:val="both"/>
+              <w:rPr>
+                <w:b/>
+                <w:bCs/>
+              </w:rPr>
+            </w:pPr>
+            <w:r>
+              <w:rPr>
+                <w:b/>
+                <w:bCs/>
+              </w:rPr>
+              <w:t>Component</w:t>
+            </w:r>
+          </w:p>
+        </w:tc>
+        <w:tc>
+          <w:tcPr>
+            <w:tcW w:w="0" w:type="auto"/>
+            <w:vAlign w:val="center"/>
+            <w:hideMark/>
+          </w:tcPr>
+          <w:p>
+            <w:pPr>
+              <w:jc w:val="both"/>
+              <w:rPr>
+                <w:b/>
+                <w:bCs/>
+              </w:rPr>
+            </w:pPr>
+            <w:r>
+              <w:rPr>
+                <w:b/>
+                <w:bCs/>
+              </w:rPr>
+              <w:t>Purpose</w:t>
+            </w:r>
+          </w:p>
+        </w:tc>
+      </w:tr>
+      <w:tr>
+        <w:trPr>
+          <w:tblCellSpacing w:w="15" w:type="dxa"/>
+          <w:jc w:val="center"/>
+        </w:trPr>
+        <w:tc>
+          <w:tcPr>
+            <w:tcW w:w="0" w:type="auto"/>
+            <w:vAlign w:val="center"/>
+            <w:hideMark/>
+          </w:tcPr>
+          <w:p>
+            <w:pPr>
+              <w:jc w:val="both"/>
+            </w:pPr>
+            <w:r>
+              <w:t>Route</w:t>
+            </w:r>
+          </w:p>
+        </w:tc>
+        <w:tc>
+          <w:tcPr>
+            <w:tcW w:w="0" w:type="auto"/>
+            <w:vAlign w:val="center"/>
+            <w:hideMark/>
+          </w:tcPr>
+          <w:p>
+            <w:pPr>
+              <w:jc w:val="both"/>
+            </w:pPr>
+            <w:r>
+              <w:t>Defines one URL path and what to render</w:t>
+            </w:r>
+          </w:p>
+        </w:tc>
+      </w:tr>
+      <w:tr>
+        <w:trPr>
+          <w:tblCellSpacing w:w="15" w:type="dxa"/>
+          <w:jc w:val="center"/>
+        </w:trPr>
+        <w:tc>
+          <w:tcPr>
+            <w:tcW w:w="0" w:type="auto"/>
+            <w:vAlign w:val="center"/>
+            <w:hideMark/>
+          </w:tcPr>
+          <w:p>
+            <w:pPr>
+              <w:jc w:val="both"/>
+            </w:pPr>
+            <w:r>
+              <w:t>Routes</w:t>
+            </w:r>
+          </w:p>
+        </w:tc>
+        <w:tc>
+          <w:tcPr>
+            <w:tcW w:w="0" w:type="auto"/>
+            <w:vAlign w:val="center"/>
+            <w:hideMark/>
+          </w:tcPr>
+          <w:p>
+            <w:pPr>
+              <w:jc w:val="both"/>
+            </w:pPr>
+            <w:r>
+              <w:t>Groups Routes and chooses the matching one</w:t>
+            </w:r>
+          </w:p>
+        </w:tc>
+      </w:tr>
+      <w:tr>
+        <w:trPr>
+          <w:tblCellSpacing w:w="15" w:type="dxa"/>
+          <w:jc w:val="center"/>
+        </w:trPr>
+        <w:tc>
+          <w:tcPr>
+            <w:tcW w:w="0" w:type="auto"/>
+            <w:vAlign w:val="center"/>
+            <w:hideMark/>
+          </w:tcPr>
+          <w:p>
+            <w:pPr>
+              <w:jc w:val="both"/>
+            </w:pPr>
+            <w:r>
+              <w:t>Route inside Routes</w:t>
+            </w:r>
+          </w:p>
+        </w:tc>
+        <w:tc>
+          <w:tcPr>
+            <w:tcW w:w="0" w:type="auto"/>
+            <w:vAlign w:val="center"/>
+            <w:hideMark/>
+          </w:tcPr>
+          <w:p>
+            <w:pPr>
+              <w:jc w:val="both"/>
+            </w:pPr>
+            <w:r>
+              <w:t>Required in React Router v6+</w:t>
+            </w:r>
+          </w:p>
+        </w:tc>
+      </w:tr>
+    </w:tbl>
+    <w:p>
+      <w:pPr>
+        <w:jc w:val="both"/>
+      </w:pPr>
+    </w:p>
+    <w:p>
+      <w:pPr>
+        <w:jc w:val="both"/>
+      </w:pPr>
+      <w:r>
+        <w:lastRenderedPageBreak/>
+        <w:t>Also,</w:t>
+      </w:r>
+    </w:p>
+    <w:p>
+      <w:pPr>
+        <w:pStyle w:val="ListParagraph"/>
+        <w:numPr>
+          <w:ilvl w:val="0"/>
+          <w:numId w:val="13"/>
+        </w:numPr>
+        <w:jc w:val="both"/>
+      </w:pPr>
+      <w:proofErr w:type="spellStart"/>
+      <w:r>
+        <w:rPr>
+          <w:b/>
+          <w:bCs/>
+        </w:rPr>
+        <w:t>BrowserRouter</w:t>
+      </w:r>
+      <w:proofErr w:type="spellEnd"/>
+      <w:r>
+        <w:t xml:space="preserve">: Enables client-side routing in a React application using the browser's History API. </w:t>
+      </w:r>
+    </w:p>
+    <w:p>
+      <w:pPr>
+        <w:pStyle w:val="ListParagraph"/>
+        <w:numPr>
+          <w:ilvl w:val="0"/>
+          <w:numId w:val="13"/>
+        </w:numPr>
+        <w:jc w:val="both"/>
+      </w:pPr>
+      <w:r>
+        <w:rPr>
+          <w:b/>
+          <w:bCs/>
+        </w:rPr>
+        <w:t>Routes</w:t>
+      </w:r>
+      <w:r>
+        <w:t xml:space="preserve">: Acts as a container for all Route components and renders the component that matches the current URL. </w:t>
+      </w:r>
+    </w:p>
+    <w:p>
+      <w:pPr>
+        <w:pStyle w:val="ListParagraph"/>
+        <w:numPr>
+          <w:ilvl w:val="0"/>
+          <w:numId w:val="13"/>
+        </w:numPr>
+        <w:jc w:val="both"/>
+      </w:pPr>
+      <w:r>
+        <w:rPr>
+          <w:b/>
+          <w:bCs/>
+        </w:rPr>
+        <w:t>Route</w:t>
+      </w:r>
+      <w:r>
+        <w:t xml:space="preserve">: Defines a specific URL path and the component that should be displayed when that path is matched. </w:t>
+      </w:r>
+    </w:p>
+    <w:p>
+      <w:pPr>
+        <w:pStyle w:val="ListParagraph"/>
+        <w:numPr>
+          <w:ilvl w:val="0"/>
+          <w:numId w:val="13"/>
+        </w:numPr>
+        <w:jc w:val="both"/>
+      </w:pPr>
+      <w:r>
+        <w:rPr>
+          <w:b/>
+          <w:bCs/>
+        </w:rPr>
+        <w:t>Link</w:t>
+      </w:r>
+      <w:r>
+        <w:t>: Used to navigate from one page to another without reloading the entire page.</w:t>
+      </w:r>
+    </w:p>
+    <w:p/>
+    <w:p>
+      <w:r>
+        <w:t>Also,</w:t>
+      </w:r>
+    </w:p>
+    <w:p>
+      <w:pPr>
+        <w:rPr>
+          <w:b/>
+          <w:bCs/>
+        </w:rPr>
+      </w:pPr>
+      <w:r>
+        <w:rPr>
+          <w:b/>
+          <w:bCs/>
+        </w:rPr>
+        <w:t>Client-Side Routing</w:t>
+      </w:r>
+    </w:p>
+    <w:p>
+      <w:pPr>
+        <w:pStyle w:val="ListParagraph"/>
+        <w:numPr>
+          <w:ilvl w:val="0"/>
+          <w:numId w:val="24"/>
+        </w:numPr>
+      </w:pPr>
+      <w:r>
+        <w:t xml:space="preserve">Routing is handled by the browser using JavaScript. </w:t>
+      </w:r>
+    </w:p>
+    <w:p>
+      <w:pPr>
+        <w:pStyle w:val="ListParagraph"/>
+        <w:numPr>
+          <w:ilvl w:val="0"/>
+          <w:numId w:val="24"/>
+        </w:numPr>
+      </w:pPr>
+      <w:r>
+        <w:t xml:space="preserve">The page does not reload when navigating between routes. </w:t>
+      </w:r>
+    </w:p>
+    <w:p>
+      <w:pPr>
+        <w:pStyle w:val="ListParagraph"/>
+        <w:numPr>
+          <w:ilvl w:val="0"/>
+          <w:numId w:val="24"/>
+        </w:numPr>
+      </w:pPr>
+      <w:r>
+        <w:t xml:space="preserve">Only the required component or content is updated. </w:t>
+      </w:r>
+    </w:p>
+    <w:p>
+      <w:pPr>
+        <w:pStyle w:val="ListParagraph"/>
+        <w:numPr>
+          <w:ilvl w:val="0"/>
+          <w:numId w:val="24"/>
+        </w:numPr>
+      </w:pPr>
+      <w:r>
+        <w:t xml:space="preserve">Provides a faster and smoother user experience. </w:t>
+      </w:r>
+    </w:p>
+    <w:p>
+      <w:pPr>
+        <w:pStyle w:val="ListParagraph"/>
+        <w:numPr>
+          <w:ilvl w:val="0"/>
+          <w:numId w:val="24"/>
+        </w:numPr>
+      </w:pPr>
+      <w:r>
+        <w:t>Commonly used in React applications with libraries like React Router.</w:t>
+      </w:r>
+    </w:p>
+    <w:p>
+      <w:pPr>
+        <w:rPr>
+          <w:b/>
+          <w:bCs/>
+        </w:rPr>
+      </w:pPr>
+      <w:r>
+        <w:rPr>
+          <w:b/>
+          <w:bCs/>
+        </w:rPr>
+        <w:t>Server-Side Routing</w:t>
+      </w:r>
+    </w:p>
+    <w:p>
+      <w:pPr>
+        <w:pStyle w:val="ListParagraph"/>
+        <w:numPr>
+          <w:ilvl w:val="0"/>
+          <w:numId w:val="26"/>
+        </w:numPr>
+      </w:pPr>
+      <w:r>
+        <w:t xml:space="preserve">Routing is handled by the web server. </w:t>
+      </w:r>
+    </w:p>
+    <w:p>
+      <w:pPr>
+        <w:pStyle w:val="ListParagraph"/>
+        <w:numPr>
+          <w:ilvl w:val="0"/>
+          <w:numId w:val="26"/>
+        </w:numPr>
+      </w:pPr>
+      <w:r>
+        <w:t xml:space="preserve">Each time a user navigates to a new URL, the browser sends a request to the server. </w:t>
+      </w:r>
+    </w:p>
+    <w:p>
+      <w:pPr>
+        <w:pStyle w:val="ListParagraph"/>
+        <w:numPr>
+          <w:ilvl w:val="0"/>
+          <w:numId w:val="26"/>
+        </w:numPr>
+      </w:pPr>
+      <w:r>
+        <w:t xml:space="preserve">The server processes the request and returns a new HTML page. </w:t>
+      </w:r>
+    </w:p>
+    <w:p>
+      <w:pPr>
+        <w:pStyle w:val="ListParagraph"/>
+        <w:numPr>
+          <w:ilvl w:val="0"/>
+          <w:numId w:val="26"/>
+        </w:numPr>
+      </w:pPr>
+      <w:r>
+        <w:t>The entire page reloads on every navigation.</w:t>
+      </w:r>
+    </w:p>
     <w:p/>
     <w:p>
       <w:r>
@@ -3784,11 +4241,6 @@
           <w:u w:val="single"/>
         </w:rPr>
         <w:t>:</w:t>
-      </w:r>
-    </w:p>
-    <w:p>
-      <w:r>
-        <w:t>Routing is the mechanism</w:t>
       </w:r>
     </w:p>
     <w:p>
@@ -10220,6 +10672,9 @@
         </mc:AlternateContent>
       </w:r>
       <w:r>
+        <w:rPr>
+          <w:noProof/>
+        </w:rPr>
         <w:drawing>
           <wp:inline distT="0" distB="0" distL="0" distR="0" wp14:anchorId="4D7A0E74" wp14:editId="4B0C29A9">
             <wp:extent cx="5731510" cy="2729865"/>
@@ -10676,6 +11131,9 @@
         </mc:AlternateContent>
       </w:r>
       <w:r>
+        <w:rPr>
+          <w:noProof/>
+        </w:rPr>
         <w:drawing>
           <wp:inline distT="0" distB="0" distL="0" distR="0" wp14:anchorId="500493D9" wp14:editId="5AA8CDFD">
             <wp:extent cx="5677392" cy="1943268"/>
@@ -10726,6 +11184,9 @@
         <w:jc w:val="both"/>
       </w:pPr>
       <w:r>
+        <w:rPr>
+          <w:noProof/>
+        </w:rPr>
         <w:drawing>
           <wp:inline distT="0" distB="0" distL="0" distR="0" wp14:anchorId="7B322FAC" wp14:editId="7C61D22A">
             <wp:extent cx="4356100" cy="835892"/>
@@ -10776,6 +11237,9 @@
         <w:jc w:val="both"/>
       </w:pPr>
       <w:r>
+        <w:rPr>
+          <w:noProof/>
+        </w:rPr>
         <w:drawing>
           <wp:inline distT="0" distB="0" distL="0" distR="0" wp14:anchorId="4A5830CA" wp14:editId="6ADF7A3E">
             <wp:extent cx="4095750" cy="769598"/>
@@ -10823,22 +11287,7 @@
         <w:jc w:val="both"/>
       </w:pPr>
       <w:r>
-        <w:t xml:space="preserve">Example: </w:t>
-      </w:r>
-      <w:r>
-        <w:t xml:space="preserve">new </w:t>
-      </w:r>
-      <w:r>
-        <w:t xml:space="preserve">way (for versions </w:t>
-      </w:r>
-      <w:r>
-        <w:t>above and equal to</w:t>
-      </w:r>
-      <w:r>
-        <w:t xml:space="preserve"> React 19).</w:t>
-      </w:r>
-      <w:r>
-        <w:t xml:space="preserve"> Same thing we will try to do.</w:t>
+        <w:t>Example: new way (for versions above and equal to React 19). Same thing we will try to do.</w:t>
       </w:r>
     </w:p>
     <w:p>
@@ -10859,6 +11308,9 @@
         <w:jc w:val="both"/>
       </w:pPr>
       <w:r>
+        <w:rPr>
+          <w:noProof/>
+        </w:rPr>
         <w:drawing>
           <wp:inline distT="0" distB="0" distL="0" distR="0" wp14:anchorId="48C57D15" wp14:editId="07FBE60B">
             <wp:extent cx="5731510" cy="2729865"/>
@@ -10920,6 +11372,9 @@
         <w:jc w:val="both"/>
       </w:pPr>
       <w:r>
+        <w:rPr>
+          <w:noProof/>
+        </w:rPr>
         <w:drawing>
           <wp:inline distT="0" distB="0" distL="0" distR="0" wp14:anchorId="48C4B25F" wp14:editId="33691FC2">
             <wp:extent cx="5731510" cy="2129790"/>
@@ -10975,6 +11430,9 @@
         <w:jc w:val="both"/>
       </w:pPr>
       <w:r>
+        <w:rPr>
+          <w:noProof/>
+        </w:rPr>
         <w:drawing>
           <wp:inline distT="0" distB="0" distL="0" distR="0" wp14:anchorId="3B3916B2" wp14:editId="18287E5D">
             <wp:extent cx="4356100" cy="835892"/>
@@ -11025,6 +11483,9 @@
         <w:jc w:val="both"/>
       </w:pPr>
       <w:r>
+        <w:rPr>
+          <w:noProof/>
+        </w:rPr>
         <w:drawing>
           <wp:inline distT="0" distB="0" distL="0" distR="0" wp14:anchorId="55AE9A45" wp14:editId="2661218F">
             <wp:extent cx="4095750" cy="769598"/>
@@ -11136,6 +11597,119 @@
 <file path=word/numbering.xml><?xml version="1.0" encoding="utf-8"?>
 <w:numbering xmlns:wpc="http://schemas.microsoft.com/office/word/2010/wordprocessingCanvas" xmlns:cx="http://schemas.microsoft.com/office/drawing/2014/chartex" xmlns:cx1="http://schemas.microsoft.com/office/drawing/2015/9/8/chartex" xmlns:cx2="http://schemas.microsoft.com/office/drawing/2015/10/21/chartex" xmlns:cx3="http://schemas.microsoft.com/office/drawing/2016/5/9/chartex" xmlns:cx4="http://schemas.microsoft.com/office/drawing/2016/5/10/chartex" xmlns:cx5="http://schemas.microsoft.com/office/drawing/2016/5/11/chartex" xmlns:cx6="http://schemas.microsoft.com/office/drawing/2016/5/12/chartex" xmlns:cx7="http://schemas.microsoft.com/office/drawing/2016/5/13/chartex" xmlns:cx8="http://schemas.microsoft.com/office/drawing/2016/5/14/chartex" xmlns:mc="http://schemas.openxmlformats.org/markup-compatibility/2006" xmlns:aink="http://schemas.microsoft.com/office/drawing/2016/ink" xmlns:am3d="http://schemas.microsoft.com/office/drawing/2017/model3d" xmlns:o="urn:schemas-microsoft-com:office:office" xmlns:oel="http://schemas.microsoft.com/office/2019/extlst" xmlns:r="http://schemas.openxmlformats.org/officeDocument/2006/relationships" xmlns:m="http://schemas.openxmlformats.org/officeDocument/2006/math" xmlns:v="urn:schemas-microsoft-com:vml" xmlns:wp14="http://schemas.microsoft.com/office/word/2010/wordprocessingDrawing" xmlns:wp="http://schemas.openxmlformats.org/drawingml/2006/wordprocessingDrawing" xmlns:w10="urn:schemas-microsoft-com:office:word" xmlns:w="http://schemas.openxmlformats.org/wordprocessingml/2006/main" xmlns:w14="http://schemas.microsoft.com/office/word/2010/wordml" xmlns:w15="http://schemas.microsoft.com/office/word/2012/wordml" xmlns:w16cex="http://schemas.microsoft.com/office/word/2018/wordml/cex" xmlns:w16cid="http://schemas.microsoft.com/office/word/2016/wordml/cid" xmlns:w16="http://schemas.microsoft.com/office/word/2018/wordml" xmlns:w16du="http://schemas.microsoft.com/office/word/2023/wordml/word16du" xmlns:w16sdtdh="http://schemas.microsoft.com/office/word/2020/wordml/sdtdatahash" xmlns:w16sdtfl="http://schemas.microsoft.com/office/word/2024/wordml/sdtformatlock" xmlns:w16se="http://schemas.microsoft.com/office/word/2015/wordml/symex" xmlns:wpg="http://schemas.microsoft.com/office/word/2010/wordprocessingGroup" xmlns:wpi="http://schemas.microsoft.com/office/word/2010/wordprocessingInk" xmlns:wne="http://schemas.microsoft.com/office/word/2006/wordml" xmlns:wps="http://schemas.microsoft.com/office/word/2010/wordprocessingShape" mc:Ignorable="w14 w15 w16se w16cid w16 w16cex w16sdtdh w16sdtfl w16du wp14">
   <w:abstractNum w:abstractNumId="0" w15:restartNumberingAfterBreak="0">
+    <w:nsid w:val="041A00D4"/>
+    <w:multiLevelType w:val="hybridMultilevel"/>
+    <w:tmpl w:val="09DCBEBE"/>
+    <w:lvl w:ilvl="0" w:tplc="40090001">
+      <w:start w:val="1"/>
+      <w:numFmt w:val="bullet"/>
+      <w:lvlText w:val=""/>
+      <w:lvlJc w:val="left"/>
+      <w:pPr>
+        <w:ind w:left="720" w:hanging="360"/>
+      </w:pPr>
+      <w:rPr>
+        <w:rFonts w:ascii="Symbol" w:hAnsi="Symbol" w:hint="default"/>
+      </w:rPr>
+    </w:lvl>
+    <w:lvl w:ilvl="1" w:tplc="40090003" w:tentative="1">
+      <w:start w:val="1"/>
+      <w:numFmt w:val="bullet"/>
+      <w:lvlText w:val="o"/>
+      <w:lvlJc w:val="left"/>
+      <w:pPr>
+        <w:ind w:left="1440" w:hanging="360"/>
+      </w:pPr>
+      <w:rPr>
+        <w:rFonts w:ascii="Courier New" w:hAnsi="Courier New" w:cs="Courier New" w:hint="default"/>
+      </w:rPr>
+    </w:lvl>
+    <w:lvl w:ilvl="2" w:tplc="40090005" w:tentative="1">
+      <w:start w:val="1"/>
+      <w:numFmt w:val="bullet"/>
+      <w:lvlText w:val=""/>
+      <w:lvlJc w:val="left"/>
+      <w:pPr>
+        <w:ind w:left="2160" w:hanging="360"/>
+      </w:pPr>
+      <w:rPr>
+        <w:rFonts w:ascii="Wingdings" w:hAnsi="Wingdings" w:hint="default"/>
+      </w:rPr>
+    </w:lvl>
+    <w:lvl w:ilvl="3" w:tplc="40090001" w:tentative="1">
+      <w:start w:val="1"/>
+      <w:numFmt w:val="bullet"/>
+      <w:lvlText w:val=""/>
+      <w:lvlJc w:val="left"/>
+      <w:pPr>
+        <w:ind w:left="2880" w:hanging="360"/>
+      </w:pPr>
+      <w:rPr>
+        <w:rFonts w:ascii="Symbol" w:hAnsi="Symbol" w:hint="default"/>
+      </w:rPr>
+    </w:lvl>
+    <w:lvl w:ilvl="4" w:tplc="40090003" w:tentative="1">
+      <w:start w:val="1"/>
+      <w:numFmt w:val="bullet"/>
+      <w:lvlText w:val="o"/>
+      <w:lvlJc w:val="left"/>
+      <w:pPr>
+        <w:ind w:left="3600" w:hanging="360"/>
+      </w:pPr>
+      <w:rPr>
+        <w:rFonts w:ascii="Courier New" w:hAnsi="Courier New" w:cs="Courier New" w:hint="default"/>
+      </w:rPr>
+    </w:lvl>
+    <w:lvl w:ilvl="5" w:tplc="40090005" w:tentative="1">
+      <w:start w:val="1"/>
+      <w:numFmt w:val="bullet"/>
+      <w:lvlText w:val=""/>
+      <w:lvlJc w:val="left"/>
+      <w:pPr>
+        <w:ind w:left="4320" w:hanging="360"/>
+      </w:pPr>
+      <w:rPr>
+        <w:rFonts w:ascii="Wingdings" w:hAnsi="Wingdings" w:hint="default"/>
+      </w:rPr>
+    </w:lvl>
+    <w:lvl w:ilvl="6" w:tplc="40090001" w:tentative="1">
+      <w:start w:val="1"/>
+      <w:numFmt w:val="bullet"/>
+      <w:lvlText w:val=""/>
+      <w:lvlJc w:val="left"/>
+      <w:pPr>
+        <w:ind w:left="5040" w:hanging="360"/>
+      </w:pPr>
+      <w:rPr>
+        <w:rFonts w:ascii="Symbol" w:hAnsi="Symbol" w:hint="default"/>
+      </w:rPr>
+    </w:lvl>
+    <w:lvl w:ilvl="7" w:tplc="40090003" w:tentative="1">
+      <w:start w:val="1"/>
+      <w:numFmt w:val="bullet"/>
+      <w:lvlText w:val="o"/>
+      <w:lvlJc w:val="left"/>
+      <w:pPr>
+        <w:ind w:left="5760" w:hanging="360"/>
+      </w:pPr>
+      <w:rPr>
+        <w:rFonts w:ascii="Courier New" w:hAnsi="Courier New" w:cs="Courier New" w:hint="default"/>
+      </w:rPr>
+    </w:lvl>
+    <w:lvl w:ilvl="8" w:tplc="40090005" w:tentative="1">
+      <w:start w:val="1"/>
+      <w:numFmt w:val="bullet"/>
+      <w:lvlText w:val=""/>
+      <w:lvlJc w:val="left"/>
+      <w:pPr>
+        <w:ind w:left="6480" w:hanging="360"/>
+      </w:pPr>
+      <w:rPr>
+        <w:rFonts w:ascii="Wingdings" w:hAnsi="Wingdings" w:hint="default"/>
+      </w:rPr>
+    </w:lvl>
+  </w:abstractNum>
+  <w:abstractNum w:abstractNumId="1" w15:restartNumberingAfterBreak="0">
     <w:nsid w:val="068668E5"/>
     <w:multiLevelType w:val="hybridMultilevel"/>
     <w:tmpl w:val="B284E5A4"/>
@@ -11248,7 +11822,156 @@
       </w:rPr>
     </w:lvl>
   </w:abstractNum>
-  <w:abstractNum w:abstractNumId="1" w15:restartNumberingAfterBreak="0">
+  <w:abstractNum w:abstractNumId="2" w15:restartNumberingAfterBreak="0">
+    <w:nsid w:val="12D82F08"/>
+    <w:multiLevelType w:val="multilevel"/>
+    <w:tmpl w:val="0A2463A2"/>
+    <w:lvl w:ilvl="0">
+      <w:start w:val="1"/>
+      <w:numFmt w:val="bullet"/>
+      <w:lvlText w:val=""/>
+      <w:lvlJc w:val="left"/>
+      <w:pPr>
+        <w:tabs>
+          <w:tab w:val="num" w:pos="720"/>
+        </w:tabs>
+        <w:ind w:left="720" w:hanging="360"/>
+      </w:pPr>
+      <w:rPr>
+        <w:rFonts w:ascii="Symbol" w:hAnsi="Symbol" w:hint="default"/>
+        <w:sz w:val="20"/>
+      </w:rPr>
+    </w:lvl>
+    <w:lvl w:ilvl="1" w:tentative="1">
+      <w:start w:val="1"/>
+      <w:numFmt w:val="bullet"/>
+      <w:lvlText w:val="o"/>
+      <w:lvlJc w:val="left"/>
+      <w:pPr>
+        <w:tabs>
+          <w:tab w:val="num" w:pos="1440"/>
+        </w:tabs>
+        <w:ind w:left="1440" w:hanging="360"/>
+      </w:pPr>
+      <w:rPr>
+        <w:rFonts w:ascii="Courier New" w:hAnsi="Courier New" w:hint="default"/>
+        <w:sz w:val="20"/>
+      </w:rPr>
+    </w:lvl>
+    <w:lvl w:ilvl="2" w:tentative="1">
+      <w:start w:val="1"/>
+      <w:numFmt w:val="bullet"/>
+      <w:lvlText w:val=""/>
+      <w:lvlJc w:val="left"/>
+      <w:pPr>
+        <w:tabs>
+          <w:tab w:val="num" w:pos="2160"/>
+        </w:tabs>
+        <w:ind w:left="2160" w:hanging="360"/>
+      </w:pPr>
+      <w:rPr>
+        <w:rFonts w:ascii="Wingdings" w:hAnsi="Wingdings" w:hint="default"/>
+        <w:sz w:val="20"/>
+      </w:rPr>
+    </w:lvl>
+    <w:lvl w:ilvl="3" w:tentative="1">
+      <w:start w:val="1"/>
+      <w:numFmt w:val="bullet"/>
+      <w:lvlText w:val=""/>
+      <w:lvlJc w:val="left"/>
+      <w:pPr>
+        <w:tabs>
+          <w:tab w:val="num" w:pos="2880"/>
+        </w:tabs>
+        <w:ind w:left="2880" w:hanging="360"/>
+      </w:pPr>
+      <w:rPr>
+        <w:rFonts w:ascii="Wingdings" w:hAnsi="Wingdings" w:hint="default"/>
+        <w:sz w:val="20"/>
+      </w:rPr>
+    </w:lvl>
+    <w:lvl w:ilvl="4" w:tentative="1">
+      <w:start w:val="1"/>
+      <w:numFmt w:val="bullet"/>
+      <w:lvlText w:val=""/>
+      <w:lvlJc w:val="left"/>
+      <w:pPr>
+        <w:tabs>
+          <w:tab w:val="num" w:pos="3600"/>
+        </w:tabs>
+        <w:ind w:left="3600" w:hanging="360"/>
+      </w:pPr>
+      <w:rPr>
+        <w:rFonts w:ascii="Wingdings" w:hAnsi="Wingdings" w:hint="default"/>
+        <w:sz w:val="20"/>
+      </w:rPr>
+    </w:lvl>
+    <w:lvl w:ilvl="5" w:tentative="1">
+      <w:start w:val="1"/>
+      <w:numFmt w:val="bullet"/>
+      <w:lvlText w:val=""/>
+      <w:lvlJc w:val="left"/>
+      <w:pPr>
+        <w:tabs>
+          <w:tab w:val="num" w:pos="4320"/>
+        </w:tabs>
+        <w:ind w:left="4320" w:hanging="360"/>
+      </w:pPr>
+      <w:rPr>
+        <w:rFonts w:ascii="Wingdings" w:hAnsi="Wingdings" w:hint="default"/>
+        <w:sz w:val="20"/>
+      </w:rPr>
+    </w:lvl>
+    <w:lvl w:ilvl="6" w:tentative="1">
+      <w:start w:val="1"/>
+      <w:numFmt w:val="bullet"/>
+      <w:lvlText w:val=""/>
+      <w:lvlJc w:val="left"/>
+      <w:pPr>
+        <w:tabs>
+          <w:tab w:val="num" w:pos="5040"/>
+        </w:tabs>
+        <w:ind w:left="5040" w:hanging="360"/>
+      </w:pPr>
+      <w:rPr>
+        <w:rFonts w:ascii="Wingdings" w:hAnsi="Wingdings" w:hint="default"/>
+        <w:sz w:val="20"/>
+      </w:rPr>
+    </w:lvl>
+    <w:lvl w:ilvl="7" w:tentative="1">
+      <w:start w:val="1"/>
+      <w:numFmt w:val="bullet"/>
+      <w:lvlText w:val=""/>
+      <w:lvlJc w:val="left"/>
+      <w:pPr>
+        <w:tabs>
+          <w:tab w:val="num" w:pos="5760"/>
+        </w:tabs>
+        <w:ind w:left="5760" w:hanging="360"/>
+      </w:pPr>
+      <w:rPr>
+        <w:rFonts w:ascii="Wingdings" w:hAnsi="Wingdings" w:hint="default"/>
+        <w:sz w:val="20"/>
+      </w:rPr>
+    </w:lvl>
+    <w:lvl w:ilvl="8" w:tentative="1">
+      <w:start w:val="1"/>
+      <w:numFmt w:val="bullet"/>
+      <w:lvlText w:val=""/>
+      <w:lvlJc w:val="left"/>
+      <w:pPr>
+        <w:tabs>
+          <w:tab w:val="num" w:pos="6480"/>
+        </w:tabs>
+        <w:ind w:left="6480" w:hanging="360"/>
+      </w:pPr>
+      <w:rPr>
+        <w:rFonts w:ascii="Wingdings" w:hAnsi="Wingdings" w:hint="default"/>
+        <w:sz w:val="20"/>
+      </w:rPr>
+    </w:lvl>
+  </w:abstractNum>
+  <w:abstractNum w:abstractNumId="3" w15:restartNumberingAfterBreak="0">
     <w:nsid w:val="15311F0A"/>
     <w:multiLevelType w:val="multilevel"/>
     <w:tmpl w:val="FB0CBBE8"/>
@@ -11397,7 +12120,7 @@
       </w:rPr>
     </w:lvl>
   </w:abstractNum>
-  <w:abstractNum w:abstractNumId="2" w15:restartNumberingAfterBreak="0">
+  <w:abstractNum w:abstractNumId="4" w15:restartNumberingAfterBreak="0">
     <w:nsid w:val="171C4C02"/>
     <w:multiLevelType w:val="hybridMultilevel"/>
     <w:tmpl w:val="8080184E"/>
@@ -11510,7 +12233,7 @@
       </w:rPr>
     </w:lvl>
   </w:abstractNum>
-  <w:abstractNum w:abstractNumId="3" w15:restartNumberingAfterBreak="0">
+  <w:abstractNum w:abstractNumId="5" w15:restartNumberingAfterBreak="0">
     <w:nsid w:val="18E36C59"/>
     <w:multiLevelType w:val="hybridMultilevel"/>
     <w:tmpl w:val="B212E27C"/>
@@ -11596,7 +12319,7 @@
       </w:pPr>
     </w:lvl>
   </w:abstractNum>
-  <w:abstractNum w:abstractNumId="4" w15:restartNumberingAfterBreak="0">
+  <w:abstractNum w:abstractNumId="6" w15:restartNumberingAfterBreak="0">
     <w:nsid w:val="1B8F7AA3"/>
     <w:multiLevelType w:val="hybridMultilevel"/>
     <w:tmpl w:val="451CCC80"/>
@@ -11709,7 +12432,7 @@
       </w:rPr>
     </w:lvl>
   </w:abstractNum>
-  <w:abstractNum w:abstractNumId="5" w15:restartNumberingAfterBreak="0">
+  <w:abstractNum w:abstractNumId="7" w15:restartNumberingAfterBreak="0">
     <w:nsid w:val="1BFD7832"/>
     <w:multiLevelType w:val="hybridMultilevel"/>
     <w:tmpl w:val="F7202AD6"/>
@@ -11822,7 +12545,7 @@
       </w:rPr>
     </w:lvl>
   </w:abstractNum>
-  <w:abstractNum w:abstractNumId="6" w15:restartNumberingAfterBreak="0">
+  <w:abstractNum w:abstractNumId="8" w15:restartNumberingAfterBreak="0">
     <w:nsid w:val="1C2A265F"/>
     <w:multiLevelType w:val="multilevel"/>
     <w:tmpl w:val="8D208102"/>
@@ -11971,7 +12694,7 @@
       </w:rPr>
     </w:lvl>
   </w:abstractNum>
-  <w:abstractNum w:abstractNumId="7" w15:restartNumberingAfterBreak="0">
+  <w:abstractNum w:abstractNumId="9" w15:restartNumberingAfterBreak="0">
     <w:nsid w:val="2009356F"/>
     <w:multiLevelType w:val="hybridMultilevel"/>
     <w:tmpl w:val="5198CF58"/>
@@ -12084,7 +12807,7 @@
       </w:rPr>
     </w:lvl>
   </w:abstractNum>
-  <w:abstractNum w:abstractNumId="8" w15:restartNumberingAfterBreak="0">
+  <w:abstractNum w:abstractNumId="10" w15:restartNumberingAfterBreak="0">
     <w:nsid w:val="202D24D0"/>
     <w:multiLevelType w:val="multilevel"/>
     <w:tmpl w:val="D8BA122E"/>
@@ -12197,7 +12920,120 @@
       </w:pPr>
     </w:lvl>
   </w:abstractNum>
-  <w:abstractNum w:abstractNumId="9" w15:restartNumberingAfterBreak="0">
+  <w:abstractNum w:abstractNumId="11" w15:restartNumberingAfterBreak="0">
+    <w:nsid w:val="264615A5"/>
+    <w:multiLevelType w:val="hybridMultilevel"/>
+    <w:tmpl w:val="181C4C98"/>
+    <w:lvl w:ilvl="0" w:tplc="40090001">
+      <w:start w:val="1"/>
+      <w:numFmt w:val="bullet"/>
+      <w:lvlText w:val=""/>
+      <w:lvlJc w:val="left"/>
+      <w:pPr>
+        <w:ind w:left="1080" w:hanging="360"/>
+      </w:pPr>
+      <w:rPr>
+        <w:rFonts w:ascii="Symbol" w:hAnsi="Symbol" w:hint="default"/>
+      </w:rPr>
+    </w:lvl>
+    <w:lvl w:ilvl="1" w:tplc="40090003" w:tentative="1">
+      <w:start w:val="1"/>
+      <w:numFmt w:val="bullet"/>
+      <w:lvlText w:val="o"/>
+      <w:lvlJc w:val="left"/>
+      <w:pPr>
+        <w:ind w:left="1800" w:hanging="360"/>
+      </w:pPr>
+      <w:rPr>
+        <w:rFonts w:ascii="Courier New" w:hAnsi="Courier New" w:cs="Courier New" w:hint="default"/>
+      </w:rPr>
+    </w:lvl>
+    <w:lvl w:ilvl="2" w:tplc="40090005" w:tentative="1">
+      <w:start w:val="1"/>
+      <w:numFmt w:val="bullet"/>
+      <w:lvlText w:val=""/>
+      <w:lvlJc w:val="left"/>
+      <w:pPr>
+        <w:ind w:left="2520" w:hanging="360"/>
+      </w:pPr>
+      <w:rPr>
+        <w:rFonts w:ascii="Wingdings" w:hAnsi="Wingdings" w:hint="default"/>
+      </w:rPr>
+    </w:lvl>
+    <w:lvl w:ilvl="3" w:tplc="40090001" w:tentative="1">
+      <w:start w:val="1"/>
+      <w:numFmt w:val="bullet"/>
+      <w:lvlText w:val=""/>
+      <w:lvlJc w:val="left"/>
+      <w:pPr>
+        <w:ind w:left="3240" w:hanging="360"/>
+      </w:pPr>
+      <w:rPr>
+        <w:rFonts w:ascii="Symbol" w:hAnsi="Symbol" w:hint="default"/>
+      </w:rPr>
+    </w:lvl>
+    <w:lvl w:ilvl="4" w:tplc="40090003" w:tentative="1">
+      <w:start w:val="1"/>
+      <w:numFmt w:val="bullet"/>
+      <w:lvlText w:val="o"/>
+      <w:lvlJc w:val="left"/>
+      <w:pPr>
+        <w:ind w:left="3960" w:hanging="360"/>
+      </w:pPr>
+      <w:rPr>
+        <w:rFonts w:ascii="Courier New" w:hAnsi="Courier New" w:cs="Courier New" w:hint="default"/>
+      </w:rPr>
+    </w:lvl>
+    <w:lvl w:ilvl="5" w:tplc="40090005" w:tentative="1">
+      <w:start w:val="1"/>
+      <w:numFmt w:val="bullet"/>
+      <w:lvlText w:val=""/>
+      <w:lvlJc w:val="left"/>
+      <w:pPr>
+        <w:ind w:left="4680" w:hanging="360"/>
+      </w:pPr>
+      <w:rPr>
+        <w:rFonts w:ascii="Wingdings" w:hAnsi="Wingdings" w:hint="default"/>
+      </w:rPr>
+    </w:lvl>
+    <w:lvl w:ilvl="6" w:tplc="40090001" w:tentative="1">
+      <w:start w:val="1"/>
+      <w:numFmt w:val="bullet"/>
+      <w:lvlText w:val=""/>
+      <w:lvlJc w:val="left"/>
+      <w:pPr>
+        <w:ind w:left="5400" w:hanging="360"/>
+      </w:pPr>
+      <w:rPr>
+        <w:rFonts w:ascii="Symbol" w:hAnsi="Symbol" w:hint="default"/>
+      </w:rPr>
+    </w:lvl>
+    <w:lvl w:ilvl="7" w:tplc="40090003" w:tentative="1">
+      <w:start w:val="1"/>
+      <w:numFmt w:val="bullet"/>
+      <w:lvlText w:val="o"/>
+      <w:lvlJc w:val="left"/>
+      <w:pPr>
+        <w:ind w:left="6120" w:hanging="360"/>
+      </w:pPr>
+      <w:rPr>
+        <w:rFonts w:ascii="Courier New" w:hAnsi="Courier New" w:cs="Courier New" w:hint="default"/>
+      </w:rPr>
+    </w:lvl>
+    <w:lvl w:ilvl="8" w:tplc="40090005" w:tentative="1">
+      <w:start w:val="1"/>
+      <w:numFmt w:val="bullet"/>
+      <w:lvlText w:val=""/>
+      <w:lvlJc w:val="left"/>
+      <w:pPr>
+        <w:ind w:left="6840" w:hanging="360"/>
+      </w:pPr>
+      <w:rPr>
+        <w:rFonts w:ascii="Wingdings" w:hAnsi="Wingdings" w:hint="default"/>
+      </w:rPr>
+    </w:lvl>
+  </w:abstractNum>
+  <w:abstractNum w:abstractNumId="12" w15:restartNumberingAfterBreak="0">
     <w:nsid w:val="317C1C36"/>
     <w:multiLevelType w:val="hybridMultilevel"/>
     <w:tmpl w:val="FFD67F9A"/>
@@ -12310,7 +13146,156 @@
       </w:rPr>
     </w:lvl>
   </w:abstractNum>
-  <w:abstractNum w:abstractNumId="10" w15:restartNumberingAfterBreak="0">
+  <w:abstractNum w:abstractNumId="13" w15:restartNumberingAfterBreak="0">
+    <w:nsid w:val="345674DE"/>
+    <w:multiLevelType w:val="multilevel"/>
+    <w:tmpl w:val="72F0E100"/>
+    <w:lvl w:ilvl="0">
+      <w:start w:val="1"/>
+      <w:numFmt w:val="bullet"/>
+      <w:lvlText w:val=""/>
+      <w:lvlJc w:val="left"/>
+      <w:pPr>
+        <w:tabs>
+          <w:tab w:val="num" w:pos="720"/>
+        </w:tabs>
+        <w:ind w:left="720" w:hanging="360"/>
+      </w:pPr>
+      <w:rPr>
+        <w:rFonts w:ascii="Symbol" w:hAnsi="Symbol" w:hint="default"/>
+        <w:sz w:val="20"/>
+      </w:rPr>
+    </w:lvl>
+    <w:lvl w:ilvl="1" w:tentative="1">
+      <w:start w:val="1"/>
+      <w:numFmt w:val="bullet"/>
+      <w:lvlText w:val="o"/>
+      <w:lvlJc w:val="left"/>
+      <w:pPr>
+        <w:tabs>
+          <w:tab w:val="num" w:pos="1440"/>
+        </w:tabs>
+        <w:ind w:left="1440" w:hanging="360"/>
+      </w:pPr>
+      <w:rPr>
+        <w:rFonts w:ascii="Courier New" w:hAnsi="Courier New" w:hint="default"/>
+        <w:sz w:val="20"/>
+      </w:rPr>
+    </w:lvl>
+    <w:lvl w:ilvl="2" w:tentative="1">
+      <w:start w:val="1"/>
+      <w:numFmt w:val="bullet"/>
+      <w:lvlText w:val=""/>
+      <w:lvlJc w:val="left"/>
+      <w:pPr>
+        <w:tabs>
+          <w:tab w:val="num" w:pos="2160"/>
+        </w:tabs>
+        <w:ind w:left="2160" w:hanging="360"/>
+      </w:pPr>
+      <w:rPr>
+        <w:rFonts w:ascii="Wingdings" w:hAnsi="Wingdings" w:hint="default"/>
+        <w:sz w:val="20"/>
+      </w:rPr>
+    </w:lvl>
+    <w:lvl w:ilvl="3" w:tentative="1">
+      <w:start w:val="1"/>
+      <w:numFmt w:val="bullet"/>
+      <w:lvlText w:val=""/>
+      <w:lvlJc w:val="left"/>
+      <w:pPr>
+        <w:tabs>
+          <w:tab w:val="num" w:pos="2880"/>
+        </w:tabs>
+        <w:ind w:left="2880" w:hanging="360"/>
+      </w:pPr>
+      <w:rPr>
+        <w:rFonts w:ascii="Wingdings" w:hAnsi="Wingdings" w:hint="default"/>
+        <w:sz w:val="20"/>
+      </w:rPr>
+    </w:lvl>
+    <w:lvl w:ilvl="4" w:tentative="1">
+      <w:start w:val="1"/>
+      <w:numFmt w:val="bullet"/>
+      <w:lvlText w:val=""/>
+      <w:lvlJc w:val="left"/>
+      <w:pPr>
+        <w:tabs>
+          <w:tab w:val="num" w:pos="3600"/>
+        </w:tabs>
+        <w:ind w:left="3600" w:hanging="360"/>
+      </w:pPr>
+      <w:rPr>
+        <w:rFonts w:ascii="Wingdings" w:hAnsi="Wingdings" w:hint="default"/>
+        <w:sz w:val="20"/>
+      </w:rPr>
+    </w:lvl>
+    <w:lvl w:ilvl="5" w:tentative="1">
+      <w:start w:val="1"/>
+      <w:numFmt w:val="bullet"/>
+      <w:lvlText w:val=""/>
+      <w:lvlJc w:val="left"/>
+      <w:pPr>
+        <w:tabs>
+          <w:tab w:val="num" w:pos="4320"/>
+        </w:tabs>
+        <w:ind w:left="4320" w:hanging="360"/>
+      </w:pPr>
+      <w:rPr>
+        <w:rFonts w:ascii="Wingdings" w:hAnsi="Wingdings" w:hint="default"/>
+        <w:sz w:val="20"/>
+      </w:rPr>
+    </w:lvl>
+    <w:lvl w:ilvl="6" w:tentative="1">
+      <w:start w:val="1"/>
+      <w:numFmt w:val="bullet"/>
+      <w:lvlText w:val=""/>
+      <w:lvlJc w:val="left"/>
+      <w:pPr>
+        <w:tabs>
+          <w:tab w:val="num" w:pos="5040"/>
+        </w:tabs>
+        <w:ind w:left="5040" w:hanging="360"/>
+      </w:pPr>
+      <w:rPr>
+        <w:rFonts w:ascii="Wingdings" w:hAnsi="Wingdings" w:hint="default"/>
+        <w:sz w:val="20"/>
+      </w:rPr>
+    </w:lvl>
+    <w:lvl w:ilvl="7" w:tentative="1">
+      <w:start w:val="1"/>
+      <w:numFmt w:val="bullet"/>
+      <w:lvlText w:val=""/>
+      <w:lvlJc w:val="left"/>
+      <w:pPr>
+        <w:tabs>
+          <w:tab w:val="num" w:pos="5760"/>
+        </w:tabs>
+        <w:ind w:left="5760" w:hanging="360"/>
+      </w:pPr>
+      <w:rPr>
+        <w:rFonts w:ascii="Wingdings" w:hAnsi="Wingdings" w:hint="default"/>
+        <w:sz w:val="20"/>
+      </w:rPr>
+    </w:lvl>
+    <w:lvl w:ilvl="8" w:tentative="1">
+      <w:start w:val="1"/>
+      <w:numFmt w:val="bullet"/>
+      <w:lvlText w:val=""/>
+      <w:lvlJc w:val="left"/>
+      <w:pPr>
+        <w:tabs>
+          <w:tab w:val="num" w:pos="6480"/>
+        </w:tabs>
+        <w:ind w:left="6480" w:hanging="360"/>
+      </w:pPr>
+      <w:rPr>
+        <w:rFonts w:ascii="Wingdings" w:hAnsi="Wingdings" w:hint="default"/>
+        <w:sz w:val="20"/>
+      </w:rPr>
+    </w:lvl>
+  </w:abstractNum>
+  <w:abstractNum w:abstractNumId="14" w15:restartNumberingAfterBreak="0">
     <w:nsid w:val="43A37D94"/>
     <w:multiLevelType w:val="multilevel"/>
     <w:tmpl w:val="DFDA5EA4"/>
@@ -12459,7 +13444,7 @@
       </w:rPr>
     </w:lvl>
   </w:abstractNum>
-  <w:abstractNum w:abstractNumId="11" w15:restartNumberingAfterBreak="0">
+  <w:abstractNum w:abstractNumId="15" w15:restartNumberingAfterBreak="0">
     <w:nsid w:val="446E79EB"/>
     <w:multiLevelType w:val="multilevel"/>
     <w:tmpl w:val="19C04956"/>
@@ -12608,7 +13593,7 @@
       </w:rPr>
     </w:lvl>
   </w:abstractNum>
-  <w:abstractNum w:abstractNumId="12" w15:restartNumberingAfterBreak="0">
+  <w:abstractNum w:abstractNumId="16" w15:restartNumberingAfterBreak="0">
     <w:nsid w:val="47B363B3"/>
     <w:multiLevelType w:val="multilevel"/>
     <w:tmpl w:val="491C0410"/>
@@ -12757,7 +13742,120 @@
       </w:rPr>
     </w:lvl>
   </w:abstractNum>
-  <w:abstractNum w:abstractNumId="13" w15:restartNumberingAfterBreak="0">
+  <w:abstractNum w:abstractNumId="17" w15:restartNumberingAfterBreak="0">
+    <w:nsid w:val="4B2C2A4D"/>
+    <w:multiLevelType w:val="hybridMultilevel"/>
+    <w:tmpl w:val="EB3630AE"/>
+    <w:lvl w:ilvl="0" w:tplc="40090001">
+      <w:start w:val="1"/>
+      <w:numFmt w:val="bullet"/>
+      <w:lvlText w:val=""/>
+      <w:lvlJc w:val="left"/>
+      <w:pPr>
+        <w:ind w:left="1080" w:hanging="360"/>
+      </w:pPr>
+      <w:rPr>
+        <w:rFonts w:ascii="Symbol" w:hAnsi="Symbol" w:hint="default"/>
+      </w:rPr>
+    </w:lvl>
+    <w:lvl w:ilvl="1" w:tplc="40090003" w:tentative="1">
+      <w:start w:val="1"/>
+      <w:numFmt w:val="bullet"/>
+      <w:lvlText w:val="o"/>
+      <w:lvlJc w:val="left"/>
+      <w:pPr>
+        <w:ind w:left="1800" w:hanging="360"/>
+      </w:pPr>
+      <w:rPr>
+        <w:rFonts w:ascii="Courier New" w:hAnsi="Courier New" w:cs="Courier New" w:hint="default"/>
+      </w:rPr>
+    </w:lvl>
+    <w:lvl w:ilvl="2" w:tplc="40090005" w:tentative="1">
+      <w:start w:val="1"/>
+      <w:numFmt w:val="bullet"/>
+      <w:lvlText w:val=""/>
+      <w:lvlJc w:val="left"/>
+      <w:pPr>
+        <w:ind w:left="2520" w:hanging="360"/>
+      </w:pPr>
+      <w:rPr>
+        <w:rFonts w:ascii="Wingdings" w:hAnsi="Wingdings" w:hint="default"/>
+      </w:rPr>
+    </w:lvl>
+    <w:lvl w:ilvl="3" w:tplc="40090001" w:tentative="1">
+      <w:start w:val="1"/>
+      <w:numFmt w:val="bullet"/>
+      <w:lvlText w:val=""/>
+      <w:lvlJc w:val="left"/>
+      <w:pPr>
+        <w:ind w:left="3240" w:hanging="360"/>
+      </w:pPr>
+      <w:rPr>
+        <w:rFonts w:ascii="Symbol" w:hAnsi="Symbol" w:hint="default"/>
+      </w:rPr>
+    </w:lvl>
+    <w:lvl w:ilvl="4" w:tplc="40090003" w:tentative="1">
+      <w:start w:val="1"/>
+      <w:numFmt w:val="bullet"/>
+      <w:lvlText w:val="o"/>
+      <w:lvlJc w:val="left"/>
+      <w:pPr>
+        <w:ind w:left="3960" w:hanging="360"/>
+      </w:pPr>
+      <w:rPr>
+        <w:rFonts w:ascii="Courier New" w:hAnsi="Courier New" w:cs="Courier New" w:hint="default"/>
+      </w:rPr>
+    </w:lvl>
+    <w:lvl w:ilvl="5" w:tplc="40090005" w:tentative="1">
+      <w:start w:val="1"/>
+      <w:numFmt w:val="bullet"/>
+      <w:lvlText w:val=""/>
+      <w:lvlJc w:val="left"/>
+      <w:pPr>
+        <w:ind w:left="4680" w:hanging="360"/>
+      </w:pPr>
+      <w:rPr>
+        <w:rFonts w:ascii="Wingdings" w:hAnsi="Wingdings" w:hint="default"/>
+      </w:rPr>
+    </w:lvl>
+    <w:lvl w:ilvl="6" w:tplc="40090001" w:tentative="1">
+      <w:start w:val="1"/>
+      <w:numFmt w:val="bullet"/>
+      <w:lvlText w:val=""/>
+      <w:lvlJc w:val="left"/>
+      <w:pPr>
+        <w:ind w:left="5400" w:hanging="360"/>
+      </w:pPr>
+      <w:rPr>
+        <w:rFonts w:ascii="Symbol" w:hAnsi="Symbol" w:hint="default"/>
+      </w:rPr>
+    </w:lvl>
+    <w:lvl w:ilvl="7" w:tplc="40090003" w:tentative="1">
+      <w:start w:val="1"/>
+      <w:numFmt w:val="bullet"/>
+      <w:lvlText w:val="o"/>
+      <w:lvlJc w:val="left"/>
+      <w:pPr>
+        <w:ind w:left="6120" w:hanging="360"/>
+      </w:pPr>
+      <w:rPr>
+        <w:rFonts w:ascii="Courier New" w:hAnsi="Courier New" w:cs="Courier New" w:hint="default"/>
+      </w:rPr>
+    </w:lvl>
+    <w:lvl w:ilvl="8" w:tplc="40090005" w:tentative="1">
+      <w:start w:val="1"/>
+      <w:numFmt w:val="bullet"/>
+      <w:lvlText w:val=""/>
+      <w:lvlJc w:val="left"/>
+      <w:pPr>
+        <w:ind w:left="6840" w:hanging="360"/>
+      </w:pPr>
+      <w:rPr>
+        <w:rFonts w:ascii="Wingdings" w:hAnsi="Wingdings" w:hint="default"/>
+      </w:rPr>
+    </w:lvl>
+  </w:abstractNum>
+  <w:abstractNum w:abstractNumId="18" w15:restartNumberingAfterBreak="0">
     <w:nsid w:val="4B332DFA"/>
     <w:multiLevelType w:val="multilevel"/>
     <w:tmpl w:val="275EBE2A"/>
@@ -12870,7 +13968,7 @@
       </w:pPr>
     </w:lvl>
   </w:abstractNum>
-  <w:abstractNum w:abstractNumId="14" w15:restartNumberingAfterBreak="0">
+  <w:abstractNum w:abstractNumId="19" w15:restartNumberingAfterBreak="0">
     <w:nsid w:val="4ED760CB"/>
     <w:multiLevelType w:val="hybridMultilevel"/>
     <w:tmpl w:val="161A4052"/>
@@ -12983,7 +14081,7 @@
       </w:rPr>
     </w:lvl>
   </w:abstractNum>
-  <w:abstractNum w:abstractNumId="15" w15:restartNumberingAfterBreak="0">
+  <w:abstractNum w:abstractNumId="20" w15:restartNumberingAfterBreak="0">
     <w:nsid w:val="5D7B12FF"/>
     <w:multiLevelType w:val="hybridMultilevel"/>
     <w:tmpl w:val="EF063CEA"/>
@@ -13096,7 +14194,7 @@
       </w:rPr>
     </w:lvl>
   </w:abstractNum>
-  <w:abstractNum w:abstractNumId="16" w15:restartNumberingAfterBreak="0">
+  <w:abstractNum w:abstractNumId="21" w15:restartNumberingAfterBreak="0">
     <w:nsid w:val="691179BD"/>
     <w:multiLevelType w:val="multilevel"/>
     <w:tmpl w:val="1C6A84A0"/>
@@ -13245,7 +14343,7 @@
       </w:rPr>
     </w:lvl>
   </w:abstractNum>
-  <w:abstractNum w:abstractNumId="17" w15:restartNumberingAfterBreak="0">
+  <w:abstractNum w:abstractNumId="22" w15:restartNumberingAfterBreak="0">
     <w:nsid w:val="69954257"/>
     <w:multiLevelType w:val="multilevel"/>
     <w:tmpl w:val="934894B0"/>
@@ -13394,7 +14492,7 @@
       </w:rPr>
     </w:lvl>
   </w:abstractNum>
-  <w:abstractNum w:abstractNumId="18" w15:restartNumberingAfterBreak="0">
+  <w:abstractNum w:abstractNumId="23" w15:restartNumberingAfterBreak="0">
     <w:nsid w:val="69CD389C"/>
     <w:multiLevelType w:val="hybridMultilevel"/>
     <w:tmpl w:val="CD5A884E"/>
@@ -13507,7 +14605,7 @@
       </w:rPr>
     </w:lvl>
   </w:abstractNum>
-  <w:abstractNum w:abstractNumId="19" w15:restartNumberingAfterBreak="0">
+  <w:abstractNum w:abstractNumId="24" w15:restartNumberingAfterBreak="0">
     <w:nsid w:val="773C13C2"/>
     <w:multiLevelType w:val="multilevel"/>
     <w:tmpl w:val="687A7A5C"/>
@@ -13656,7 +14754,7 @@
       </w:rPr>
     </w:lvl>
   </w:abstractNum>
-  <w:abstractNum w:abstractNumId="20" w15:restartNumberingAfterBreak="0">
+  <w:abstractNum w:abstractNumId="25" w15:restartNumberingAfterBreak="0">
     <w:nsid w:val="795744E3"/>
     <w:multiLevelType w:val="hybridMultilevel"/>
     <w:tmpl w:val="EB5E39F8"/>
@@ -13743,67 +14841,82 @@
     </w:lvl>
   </w:abstractNum>
   <w:num w:numId="1" w16cid:durableId="683484970">
+    <w:abstractNumId w:val="21"/>
+  </w:num>
+  <w:num w:numId="2" w16cid:durableId="1794984091">
+    <w:abstractNumId w:val="6"/>
+  </w:num>
+  <w:num w:numId="3" w16cid:durableId="568728765">
     <w:abstractNumId w:val="16"/>
   </w:num>
-  <w:num w:numId="2" w16cid:durableId="1794984091">
+  <w:num w:numId="4" w16cid:durableId="1862161860">
     <w:abstractNumId w:val="4"/>
   </w:num>
-  <w:num w:numId="3" w16cid:durableId="568728765">
+  <w:num w:numId="5" w16cid:durableId="1414161127">
+    <w:abstractNumId w:val="8"/>
+  </w:num>
+  <w:num w:numId="6" w16cid:durableId="512458470">
+    <w:abstractNumId w:val="7"/>
+  </w:num>
+  <w:num w:numId="7" w16cid:durableId="1678076879">
+    <w:abstractNumId w:val="10"/>
+  </w:num>
+  <w:num w:numId="8" w16cid:durableId="1802190281">
+    <w:abstractNumId w:val="5"/>
+  </w:num>
+  <w:num w:numId="9" w16cid:durableId="1824396930">
+    <w:abstractNumId w:val="15"/>
+  </w:num>
+  <w:num w:numId="10" w16cid:durableId="814225122">
+    <w:abstractNumId w:val="9"/>
+  </w:num>
+  <w:num w:numId="11" w16cid:durableId="260529889">
     <w:abstractNumId w:val="12"/>
   </w:num>
-  <w:num w:numId="4" w16cid:durableId="1862161860">
+  <w:num w:numId="12" w16cid:durableId="396318072">
+    <w:abstractNumId w:val="3"/>
+  </w:num>
+  <w:num w:numId="13" w16cid:durableId="1742408544">
+    <w:abstractNumId w:val="1"/>
+  </w:num>
+  <w:num w:numId="14" w16cid:durableId="1983925706">
+    <w:abstractNumId w:val="18"/>
+  </w:num>
+  <w:num w:numId="15" w16cid:durableId="633213442">
+    <w:abstractNumId w:val="25"/>
+  </w:num>
+  <w:num w:numId="16" w16cid:durableId="1207990616">
+    <w:abstractNumId w:val="24"/>
+  </w:num>
+  <w:num w:numId="17" w16cid:durableId="1130709428">
+    <w:abstractNumId w:val="20"/>
+  </w:num>
+  <w:num w:numId="18" w16cid:durableId="1632635083">
+    <w:abstractNumId w:val="22"/>
+  </w:num>
+  <w:num w:numId="19" w16cid:durableId="1651715980">
+    <w:abstractNumId w:val="19"/>
+  </w:num>
+  <w:num w:numId="20" w16cid:durableId="288317936">
+    <w:abstractNumId w:val="14"/>
+  </w:num>
+  <w:num w:numId="21" w16cid:durableId="372921595">
+    <w:abstractNumId w:val="23"/>
+  </w:num>
+  <w:num w:numId="22" w16cid:durableId="1281837877">
+    <w:abstractNumId w:val="0"/>
+  </w:num>
+  <w:num w:numId="23" w16cid:durableId="1243678832">
     <w:abstractNumId w:val="2"/>
   </w:num>
-  <w:num w:numId="5" w16cid:durableId="1414161127">
-    <w:abstractNumId w:val="6"/>
+  <w:num w:numId="24" w16cid:durableId="318654103">
+    <w:abstractNumId w:val="17"/>
   </w:num>
-  <w:num w:numId="6" w16cid:durableId="512458470">
-    <w:abstractNumId w:val="5"/>
-  </w:num>
-  <w:num w:numId="7" w16cid:durableId="1678076879">
-    <w:abstractNumId w:val="8"/>
-  </w:num>
-  <w:num w:numId="8" w16cid:durableId="1802190281">
-    <w:abstractNumId w:val="3"/>
-  </w:num>
-  <w:num w:numId="9" w16cid:durableId="1824396930">
-    <w:abstractNumId w:val="11"/>
-  </w:num>
-  <w:num w:numId="10" w16cid:durableId="814225122">
-    <w:abstractNumId w:val="7"/>
-  </w:num>
-  <w:num w:numId="11" w16cid:durableId="260529889">
-    <w:abstractNumId w:val="9"/>
-  </w:num>
-  <w:num w:numId="12" w16cid:durableId="396318072">
-    <w:abstractNumId w:val="1"/>
-  </w:num>
-  <w:num w:numId="13" w16cid:durableId="1742408544">
-    <w:abstractNumId w:val="0"/>
-  </w:num>
-  <w:num w:numId="14" w16cid:durableId="1983925706">
+  <w:num w:numId="25" w16cid:durableId="940407371">
     <w:abstractNumId w:val="13"/>
   </w:num>
-  <w:num w:numId="15" w16cid:durableId="633213442">
-    <w:abstractNumId w:val="20"/>
-  </w:num>
-  <w:num w:numId="16" w16cid:durableId="1207990616">
-    <w:abstractNumId w:val="19"/>
-  </w:num>
-  <w:num w:numId="17" w16cid:durableId="1130709428">
-    <w:abstractNumId w:val="15"/>
-  </w:num>
-  <w:num w:numId="18" w16cid:durableId="1632635083">
-    <w:abstractNumId w:val="17"/>
-  </w:num>
-  <w:num w:numId="19" w16cid:durableId="1651715980">
-    <w:abstractNumId w:val="14"/>
-  </w:num>
-  <w:num w:numId="20" w16cid:durableId="288317936">
-    <w:abstractNumId w:val="10"/>
-  </w:num>
-  <w:num w:numId="21" w16cid:durableId="372921595">
-    <w:abstractNumId w:val="18"/>
+  <w:num w:numId="26" w16cid:durableId="906376145">
+    <w:abstractNumId w:val="11"/>
   </w:num>
 </w:numbering>
 </file>
@@ -14725,6 +15838,29 @@
       <w:spacing w:val="5"/>
     </w:rPr>
   </w:style>
+  <w:style w:type="character" w:styleId="Hyperlink">
+    <w:name w:val="Hyperlink"/>
+    <w:basedOn w:val="DefaultParagraphFont"/>
+    <w:uiPriority w:val="99"/>
+    <w:unhideWhenUsed/>
+    <w:rsid w:val="00ED47BF"/>
+    <w:rPr>
+      <w:color w:val="0563C1" w:themeColor="hyperlink"/>
+      <w:u w:val="single"/>
+    </w:rPr>
+  </w:style>
+  <w:style w:type="character" w:styleId="UnresolvedMention">
+    <w:name w:val="Unresolved Mention"/>
+    <w:basedOn w:val="DefaultParagraphFont"/>
+    <w:uiPriority w:val="99"/>
+    <w:semiHidden/>
+    <w:unhideWhenUsed/>
+    <w:rsid w:val="00ED47BF"/>
+    <w:rPr>
+      <w:color w:val="605E5C"/>
+      <w:shd w:val="clear" w:color="auto" w:fill="E1DFDD"/>
+    </w:rPr>
+  </w:style>
 </w:styles>
 </file>
 

</xml_diff>